<commit_message>
fix: unify summary names and report assembly version
</commit_message>
<xml_diff>
--- a/docs/B组其他费用服务实现说明.docx
+++ b/docs/B组其他费用服务实现说明.docx
@@ -15,7 +15,7 @@
         <w:pStyle w:val="Subtitle"/>
       </w:pPr>
       <w:r>
-        <w:t>其他费用录入 导入 导出   2026年10月10日</w:t>
+        <w:t>其他费用录入 导入 导出  2026年10月11日</w:t>
       </w:r>
     </w:p>
     <w:p>
@@ -25,7 +25,7 @@
     </w:p>
     <w:p>
       <w:r>
-        <w:t>应用使用C# 7.3和.NET Framework 4.8，运行于Windows x64；WebAPI 2与OWIN提供本地HTTP服务，NPOI 2.7.6负责业务Excel解析和生成。程序及材料已整理完成，业务实现沿用验证通过的提交4d54e7c。</w:t>
+        <w:t>应用使用C# 7.3和.NET Framework 4.8，运行于Windows x64；WebAPI 2与OWIN提供本地HTTP服务，NPOI 2.7.6负责Excel解析和生成。当前1.0.1统一名称规则并更新健康接口；旧版验证记录保留。</w:t>
       </w:r>
     </w:p>
     <w:p>
@@ -433,7 +433,7 @@
     </w:p>
     <w:p>
       <w:r>
-        <w:t>名称必填，去掉两端空白后进行Unicode NFC规范化，按大小写敏感比较。同项目名称唯一；手工新增或改名冲突返回409。固定工项、章节及合计名称被保留，防止十列导入时产生歧义。</w:t>
+        <w:t>名称必填，去首尾空白并进行Unicode NFC规范化，项目内唯一，冲突返回409。SummaryNames统一费用校验与导入识别，保留固定工项、章节、合计、小计及税金百分比名称；合计审核费等正常名称允许。旧保留名称仍可读取，修改时须改名。</w:t>
       </w:r>
     </w:p>
     <w:p>
@@ -1190,7 +1190,7 @@
     </w:p>
     <w:p>
       <w:r>
-        <w:t>读取器维护Unknown、Construction、Outside三种状态。只有确认处于“一 建设安装工程费”、序号为正整数且名称不是六个固定工项的明细，才可作为其他费用候选。标题、空行、重复表头、正常章节、固定工项和合计跳过。</w:t>
+        <w:t>读取器维护Unknown、Construction、Outside三种状态。确认处于“一 建设安装工程费”且序号为正整数的其他费用才可导入。正常章节、对应序号的六个固定项和非明细合计跳过；数字序号明细使用保留名称时报告行号与NAME_RESERVED，不静默跳过。</w:t>
       </w:r>
     </w:p>
     <w:p>
@@ -2414,7 +2414,7 @@
     </w:p>
     <w:p>
       <w:r>
-        <w:t>默认http://localhost:5080/api/health；初次启动自动初始化自己的App_Data数据库，包内没有已有演示数据。源码运行使用scripts/build.ps1及scripts/run.ps1。首次源码构建联网准备便携SDK并锁定还原NuGet；目标运行时仍为.NET Framework 4.8。</w:t>
+        <w:t>默认http://localhost:5080/api/health，返回Status与实际API程序集Version，当前1.0.1。初次启动初始化自己的数据库。源码用scripts/build.ps1及scripts/run.ps1运行；首次构建联网准备SDK并锁定还原NuGet，目标运行时仍为.NET Framework 4.8。</w:t>
       </w:r>
     </w:p>
     <w:p>
@@ -2720,7 +2720,7 @@
     </w:p>
     <w:p>
       <w:r>
-        <w:t>干净源码来自提交4d54e7c的git archive，在当前Windows机器使用已有NuGet缓存完成构建和验证；不等同于全新系统或离线还原。收尾时逐一核对43个受Git管理的src/tests/database文件，除行尾差异外与验证归档一致，没有修改业务实现，也未重新运行这些测试。</w:t>
+        <w:t>历史91项测试及32项HTTP记录来自4d54e7c的git archive，在当前Windows机器复用NuGet缓存完成，不等同于全新系统或离线还原。1.0.1使用锁定依赖独立Release构建，0警告、0错误；本次未新增或运行测试，历史记录不代表本次回归结果。</w:t>
       </w:r>
     </w:p>
     <w:p>

</xml_diff>